<commit_message>
docs: add executable PowerShell deployment verification commands
</commit_message>
<xml_diff>
--- a/submission/周兴富-双镜D²Guard-部署说明文档.docx
+++ b/submission/周兴富-双镜D²Guard-部署说明文档.docx
@@ -5901,55 +5901,23 @@
           <w:b w:val="0"/>
           <w:sz w:val="24"/>
         </w:rPr>
-        <w:t>（1）</w:t>
-      </w:r>
-      <w:r>
-        <w:rPr>
-          <w:rFonts w:ascii="Times New Roman" w:hAnsi="Times New Roman" w:eastAsia="宋体" w:cs="Times New Roman"/>
-          <w:b/>
-          <w:sz w:val="24"/>
-        </w:rPr>
-        <w:t>单元测试。</w:t>
-      </w:r>
-      <w:r>
-        <w:rPr>
-          <w:rFonts w:ascii="Times New Roman" w:hAnsi="Times New Roman" w:eastAsia="宋体" w:cs="Times New Roman"/>
-          <w:b w:val="0"/>
-          <w:sz w:val="24"/>
-        </w:rPr>
-        <w:t xml:space="preserve">在程序目录下执行以下命令，Python 单元测试、控制台测试与 Node.js 测试均应全部通过。Windows 下将解释器替换为 </w:t>
-      </w:r>
-      <w:r>
-        <w:rPr>
-          <w:rFonts w:ascii="Times New Roman" w:hAnsi="Times New Roman" w:eastAsia="宋体" w:cs="Times New Roman"/>
-          <w:b w:val="0"/>
-          <w:sz w:val="24"/>
-        </w:rPr>
-        <w:t>.venv-windows\Scripts\python.exe</w:t>
-      </w:r>
-      <w:r>
-        <w:rPr>
-          <w:rFonts w:ascii="Times New Roman" w:hAnsi="Times New Roman" w:eastAsia="宋体" w:cs="Times New Roman"/>
-          <w:b w:val="0"/>
-          <w:sz w:val="24"/>
-        </w:rPr>
-        <w:t xml:space="preserve">，PowerShell 中 </w:t>
-      </w:r>
-      <w:r>
-        <w:rPr>
-          <w:rFonts w:ascii="Times New Roman" w:hAnsi="Times New Roman" w:eastAsia="宋体" w:cs="Times New Roman"/>
-          <w:b w:val="0"/>
-          <w:sz w:val="24"/>
-        </w:rPr>
-        <w:t>PYTHONPATH</w:t>
-      </w:r>
-      <w:r>
-        <w:rPr>
-          <w:rFonts w:ascii="Times New Roman" w:hAnsi="Times New Roman" w:eastAsia="宋体" w:cs="Times New Roman"/>
-          <w:b w:val="0"/>
-          <w:sz w:val="24"/>
-        </w:rPr>
-        <w:t xml:space="preserve"> 的分隔符为分号。</w:t>
+        <w:t xml:space="preserve">（1）单元测试。在程序目录下执行以下命令，Python 单元测试、控制台测试与 Node.js 测试均应全部通过。请按操作系统选择对应命令。</w:t>
+      </w:r>
+    </w:p>
+    <w:p>
+      <w:pPr>
+        <w:snapToGrid w:val="0"/>
+        <w:spacing w:before="0" w:after="0" w:line="360" w:lineRule="auto"/>
+        <w:ind w:firstLine="480"/>
+        <w:jc w:val="left"/>
+      </w:pPr>
+      <w:r>
+        <w:rPr>
+          <w:rFonts w:ascii="Times New Roman" w:hAnsi="Times New Roman" w:eastAsia="宋体" w:cs="Times New Roman"/>
+          <w:b w:val="0"/>
+          <w:sz w:val="24"/>
+        </w:rPr>
+        <w:t xml:space="preserve">Linux：</w:t>
       </w:r>
     </w:p>
     <w:p>
@@ -5998,6 +5966,102 @@
           <w:sz w:val="18"/>
         </w:rPr>
         <w:t>npm test</w:t>
+      </w:r>
+    </w:p>
+    <w:p>
+      <w:pPr>
+        <w:snapToGrid w:val="0"/>
+        <w:spacing w:before="0" w:after="0" w:line="360" w:lineRule="auto"/>
+        <w:ind w:firstLine="480"/>
+        <w:jc w:val="left"/>
+      </w:pPr>
+      <w:r>
+        <w:rPr>
+          <w:rFonts w:ascii="Times New Roman" w:hAnsi="Times New Roman" w:eastAsia="宋体" w:cs="Times New Roman"/>
+          <w:b w:val="0"/>
+          <w:sz w:val="24"/>
+        </w:rPr>
+        <w:t xml:space="preserve">Windows PowerShell：</w:t>
+      </w:r>
+    </w:p>
+    <w:p>
+      <w:pPr>
+        <w:shd w:val="clear" w:color="auto" w:fill="F3F5F8"/>
+        <w:snapToGrid w:val="0"/>
+        <w:spacing w:before="80" w:after="0" w:lineRule="exact" w:line="260"/>
+        <w:ind w:left="240"/>
+        <w:jc w:val="left"/>
+      </w:pPr>
+      <w:r>
+        <w:rPr>
+          <w:rFonts w:ascii="Consolas" w:hAnsi="Consolas" w:eastAsia="宋体" w:cs="Consolas"/>
+          <w:sz w:val="18"/>
+        </w:rPr>
+        <w:t xml:space="preserve">$env:PYTHONPATH = "$PWD/src;$PWD/tests"</w:t>
+      </w:r>
+    </w:p>
+    <w:p>
+      <w:pPr>
+        <w:shd w:val="clear" w:color="auto" w:fill="F3F5F8"/>
+        <w:snapToGrid w:val="0"/>
+        <w:spacing w:before="80" w:after="0" w:lineRule="exact" w:line="260"/>
+        <w:ind w:left="240"/>
+        <w:jc w:val="left"/>
+      </w:pPr>
+      <w:r>
+        <w:rPr>
+          <w:rFonts w:ascii="Consolas" w:hAnsi="Consolas" w:eastAsia="宋体" w:cs="Consolas"/>
+          <w:sz w:val="18"/>
+        </w:rPr>
+        <w:t xml:space="preserve">.\.venv-windows\Scripts\python.exe -m unittest discover -s tests -p 'test_*.py'</w:t>
+      </w:r>
+    </w:p>
+    <w:p>
+      <w:pPr>
+        <w:shd w:val="clear" w:color="auto" w:fill="F3F5F8"/>
+        <w:snapToGrid w:val="0"/>
+        <w:spacing w:before="80" w:after="0" w:lineRule="exact" w:line="260"/>
+        <w:ind w:left="240"/>
+        <w:jc w:val="left"/>
+      </w:pPr>
+      <w:r>
+        <w:rPr>
+          <w:rFonts w:ascii="Consolas" w:hAnsi="Consolas" w:eastAsia="宋体" w:cs="Consolas"/>
+          <w:sz w:val="18"/>
+        </w:rPr>
+        <w:t xml:space="preserve">$env:PYTHONPATH = "$PWD/src;$PWD/console;$PWD/tests"</w:t>
+      </w:r>
+    </w:p>
+    <w:p>
+      <w:pPr>
+        <w:shd w:val="clear" w:color="auto" w:fill="F3F5F8"/>
+        <w:snapToGrid w:val="0"/>
+        <w:spacing w:before="80" w:after="0" w:lineRule="exact" w:line="260"/>
+        <w:ind w:left="240"/>
+        <w:jc w:val="left"/>
+      </w:pPr>
+      <w:r>
+        <w:rPr>
+          <w:rFonts w:ascii="Consolas" w:hAnsi="Consolas" w:eastAsia="宋体" w:cs="Consolas"/>
+          <w:sz w:val="18"/>
+        </w:rPr>
+        <w:t xml:space="preserve">.\.venv-windows\Scripts\python.exe -m unittest discover -s console -p 'test_*.py'</w:t>
+      </w:r>
+    </w:p>
+    <w:p>
+      <w:pPr>
+        <w:shd w:val="clear" w:color="auto" w:fill="F3F5F8"/>
+        <w:snapToGrid w:val="0"/>
+        <w:spacing w:before="80" w:after="0" w:lineRule="exact" w:line="260"/>
+        <w:ind w:left="240"/>
+        <w:jc w:val="left"/>
+      </w:pPr>
+      <w:r>
+        <w:rPr>
+          <w:rFonts w:ascii="Consolas" w:hAnsi="Consolas" w:eastAsia="宋体" w:cs="Consolas"/>
+          <w:sz w:val="18"/>
+        </w:rPr>
+        <w:t xml:space="preserve">npm test</w:t>
       </w:r>
     </w:p>
     <w:p>

</xml_diff>